<commit_message>
fase 3 (BE done, FE progress)
</commit_message>
<xml_diff>
--- a/backend/src/templates/Quotation Form V2.docx
+++ b/backend/src/templates/Quotation Form V2.docx
@@ -1196,7 +1196,8 @@
     <w:p>
       <w:pPr>
         <w:shd w:val="clear" w:color="auto" w:fill="FFFFFF" w:themeFill="background1"/>
-        <w:spacing w:after="0"/>
+        <w:spacing w:after="0" w:line="240" w:lineRule="auto"/>
+        <w:contextualSpacing/>
         <w:rPr>
           <w:b/>
           <w:bCs/>
@@ -1229,7 +1230,8 @@
     <w:p>
       <w:pPr>
         <w:shd w:val="clear" w:color="auto" w:fill="FFFFFF" w:themeFill="background1"/>
-        <w:spacing w:after="0"/>
+        <w:spacing w:after="0" w:line="240" w:lineRule="auto"/>
+        <w:contextualSpacing/>
         <w:rPr>
           <w:b/>
           <w:bCs/>
@@ -1246,9 +1248,8 @@
           <w:szCs w:val="22"/>
           <w:lang w:val="en-US"/>
         </w:rPr>
-        <w:t>{{list}</w:t>
-      </w:r>
-      <w:proofErr w:type="gramStart"/>
+        <w:t>{{list}}.{{desc}}</w:t>
+      </w:r>
       <w:r>
         <w:rPr>
           <w:b/>
@@ -1257,34 +1258,14 @@
           <w:szCs w:val="22"/>
           <w:lang w:val="en-US"/>
         </w:rPr>
-        <w:t>}.{</w:t>
-      </w:r>
-      <w:proofErr w:type="gramEnd"/>
-      <w:r>
-        <w:rPr>
-          <w:b/>
-          <w:bCs/>
-          <w:sz w:val="22"/>
-          <w:szCs w:val="22"/>
-          <w:lang w:val="en-US"/>
-        </w:rPr>
-        <w:t>{desc}}</w:t>
-      </w:r>
-      <w:r>
-        <w:rPr>
-          <w:b/>
-          <w:bCs/>
-          <w:sz w:val="22"/>
-          <w:szCs w:val="22"/>
-          <w:lang w:val="en-US"/>
-        </w:rPr>
         <w:t xml:space="preserve"> </w:t>
       </w:r>
     </w:p>
     <w:p>
       <w:pPr>
         <w:shd w:val="clear" w:color="auto" w:fill="FFFFFF" w:themeFill="background1"/>
-        <w:spacing w:after="0"/>
+        <w:spacing w:after="0" w:line="240" w:lineRule="auto"/>
+        <w:contextualSpacing/>
         <w:rPr>
           <w:b/>
           <w:bCs/>
@@ -1478,25 +1459,7 @@
           <w:szCs w:val="22"/>
           <w:lang w:val="en-US"/>
         </w:rPr>
-        <w:t>{{</w:t>
-      </w:r>
-      <w:proofErr w:type="spellStart"/>
-      <w:r>
-        <w:rPr>
-          <w:sz w:val="22"/>
-          <w:szCs w:val="22"/>
-          <w:lang w:val="en-US"/>
-        </w:rPr>
-        <w:t>material_price</w:t>
-      </w:r>
-      <w:proofErr w:type="spellEnd"/>
-      <w:r>
-        <w:rPr>
-          <w:sz w:val="22"/>
-          <w:szCs w:val="22"/>
-          <w:lang w:val="en-US"/>
-        </w:rPr>
-        <w:t>}},00</w:t>
+        <w:t>{{material_price}},00</w:t>
       </w:r>
     </w:p>
     <w:p>
@@ -3585,10 +3548,10 @@
       </w:tblPr>
       <w:tblGrid>
         <w:gridCol w:w="562"/>
-        <w:gridCol w:w="2835"/>
-        <w:gridCol w:w="993"/>
+        <w:gridCol w:w="2268"/>
+        <w:gridCol w:w="1134"/>
+        <w:gridCol w:w="3686"/>
         <w:gridCol w:w="1842"/>
-        <w:gridCol w:w="3260"/>
       </w:tblGrid>
       <w:tr>
         <w:tc>
@@ -3631,7 +3594,7 @@
         </w:tc>
         <w:tc>
           <w:tcPr>
-            <w:tcW w:w="2835" w:type="dxa"/>
+            <w:tcW w:w="2268" w:type="dxa"/>
             <w:shd w:val="clear" w:color="auto" w:fill="000000" w:themeFill="text1"/>
           </w:tcPr>
           <w:p>
@@ -3659,7 +3622,7 @@
         </w:tc>
         <w:tc>
           <w:tcPr>
-            <w:tcW w:w="993" w:type="dxa"/>
+            <w:tcW w:w="1134" w:type="dxa"/>
             <w:shd w:val="clear" w:color="auto" w:fill="000000" w:themeFill="text1"/>
           </w:tcPr>
           <w:p>
@@ -3682,6 +3645,34 @@
                 <w:lang w:val="en-US"/>
               </w:rPr>
               <w:t>Pictures</w:t>
+            </w:r>
+          </w:p>
+        </w:tc>
+        <w:tc>
+          <w:tcPr>
+            <w:tcW w:w="3686" w:type="dxa"/>
+            <w:shd w:val="clear" w:color="auto" w:fill="000000" w:themeFill="text1"/>
+          </w:tcPr>
+          <w:p>
+            <w:pPr>
+              <w:jc w:val="center"/>
+              <w:rPr>
+                <w:b/>
+                <w:bCs/>
+                <w:sz w:val="20"/>
+                <w:szCs w:val="20"/>
+                <w:lang w:val="en-US"/>
+              </w:rPr>
+            </w:pPr>
+            <w:r>
+              <w:rPr>
+                <w:b/>
+                <w:bCs/>
+                <w:sz w:val="20"/>
+                <w:szCs w:val="20"/>
+                <w:lang w:val="en-US"/>
+              </w:rPr>
+              <w:t>Condition</w:t>
             </w:r>
           </w:p>
         </w:tc>
@@ -3709,34 +3700,6 @@
                 <w:szCs w:val="20"/>
                 <w:lang w:val="en-US"/>
               </w:rPr>
-              <w:t>Condition</w:t>
-            </w:r>
-          </w:p>
-        </w:tc>
-        <w:tc>
-          <w:tcPr>
-            <w:tcW w:w="3260" w:type="dxa"/>
-            <w:shd w:val="clear" w:color="auto" w:fill="000000" w:themeFill="text1"/>
-          </w:tcPr>
-          <w:p>
-            <w:pPr>
-              <w:jc w:val="center"/>
-              <w:rPr>
-                <w:b/>
-                <w:bCs/>
-                <w:sz w:val="20"/>
-                <w:szCs w:val="20"/>
-                <w:lang w:val="en-US"/>
-              </w:rPr>
-            </w:pPr>
-            <w:r>
-              <w:rPr>
-                <w:b/>
-                <w:bCs/>
-                <w:sz w:val="20"/>
-                <w:szCs w:val="20"/>
-                <w:lang w:val="en-US"/>
-              </w:rPr>
               <w:t>Measure</w:t>
             </w:r>
           </w:p>
@@ -3751,11 +3714,41 @@
             <w:r>
               <w:t>{{#inspections}}</w:t>
             </w:r>
-          </w:p>
-        </w:tc>
-        <w:tc>
-          <w:tcPr>
-            <w:tcW w:w="2835" w:type="dxa"/>
+            <w:r>
+              <w:rPr>
+                <w:b/>
+                <w:bCs/>
+                <w:sz w:val="20"/>
+                <w:szCs w:val="20"/>
+                <w:lang w:val="en-US"/>
+              </w:rPr>
+              <w:t>{{</w:t>
+            </w:r>
+            <w:r>
+              <w:rPr>
+                <w:b/>
+                <w:bCs/>
+                <w:sz w:val="20"/>
+                <w:szCs w:val="20"/>
+                <w:lang w:val="en-US"/>
+              </w:rPr>
+              <w:t>no</w:t>
+            </w:r>
+            <w:r>
+              <w:rPr>
+                <w:b/>
+                <w:bCs/>
+                <w:sz w:val="20"/>
+                <w:szCs w:val="20"/>
+                <w:lang w:val="en-US"/>
+              </w:rPr>
+              <w:t>}}</w:t>
+            </w:r>
+          </w:p>
+        </w:tc>
+        <w:tc>
+          <w:tcPr>
+            <w:tcW w:w="2268" w:type="dxa"/>
           </w:tcPr>
           <w:p>
             <w:pPr>
@@ -3782,7 +3775,7 @@
         </w:tc>
         <w:tc>
           <w:tcPr>
-            <w:tcW w:w="993" w:type="dxa"/>
+            <w:tcW w:w="1134" w:type="dxa"/>
           </w:tcPr>
           <w:p>
             <w:pPr>
@@ -3808,6 +3801,689 @@
         </w:tc>
         <w:tc>
           <w:tcPr>
+            <w:tcW w:w="3686" w:type="dxa"/>
+          </w:tcPr>
+          <w:p>
+            <w:pPr>
+              <w:shd w:val="clear" w:color="auto" w:fill="FFFFFF" w:themeFill="background1"/>
+              <w:rPr>
+                <w:b/>
+                <w:bCs/>
+                <w:sz w:val="20"/>
+                <w:szCs w:val="20"/>
+                <w:lang w:val="en-US"/>
+              </w:rPr>
+            </w:pPr>
+            <w:r>
+              <w:rPr>
+                <w:b/>
+                <w:bCs/>
+                <w:sz w:val="20"/>
+                <w:szCs w:val="20"/>
+                <w:lang w:val="en-US"/>
+              </w:rPr>
+              <w:t>{</w:t>
+            </w:r>
+            <w:r>
+              <w:rPr>
+                <w:b/>
+                <w:bCs/>
+                <w:sz w:val="20"/>
+                <w:szCs w:val="20"/>
+                <w:lang w:val="en-US"/>
+              </w:rPr>
+              <w:t>{condition}</w:t>
+            </w:r>
+            <w:r>
+              <w:rPr>
+                <w:b/>
+                <w:bCs/>
+                <w:sz w:val="20"/>
+                <w:szCs w:val="20"/>
+                <w:lang w:val="en-US"/>
+              </w:rPr>
+              <w:t>}{</w:t>
+            </w:r>
+            <w:r>
+              <w:rPr>
+                <w:b/>
+                <w:bCs/>
+                <w:sz w:val="20"/>
+                <w:szCs w:val="20"/>
+                <w:lang w:val="en-US"/>
+              </w:rPr>
+              <w:t>{#has_measurements}</w:t>
+            </w:r>
+            <w:r>
+              <w:rPr>
+                <w:b/>
+                <w:bCs/>
+                <w:sz w:val="20"/>
+                <w:szCs w:val="20"/>
+                <w:lang w:val="en-US"/>
+              </w:rPr>
+              <w:t>}</w:t>
+            </w:r>
+          </w:p>
+          <w:tbl>
+            <w:tblPr>
+              <w:tblStyle w:val="TableGrid"/>
+              <w:tblW w:w="0" w:type="auto"/>
+              <w:tblLook w:val="04A0" w:firstRow="1" w:lastRow="0" w:firstColumn="1" w:lastColumn="0" w:noHBand="0" w:noVBand="1"/>
+            </w:tblPr>
+            <w:tblGrid>
+              <w:gridCol w:w="1153"/>
+              <w:gridCol w:w="1153"/>
+              <w:gridCol w:w="1154"/>
+            </w:tblGrid>
+            <w:tr>
+              <w:tc>
+                <w:tcPr>
+                  <w:tcW w:w="1153" w:type="dxa"/>
+                </w:tcPr>
+                <w:p>
+                  <w:pPr>
+                    <w:jc w:val="center"/>
+                    <w:rPr>
+                      <w:b/>
+                      <w:bCs/>
+                      <w:sz w:val="20"/>
+                      <w:szCs w:val="20"/>
+                      <w:lang w:val="en-US"/>
+                    </w:rPr>
+                  </w:pPr>
+                  <w:r>
+                    <w:rPr>
+                      <w:b/>
+                      <w:bCs/>
+                      <w:sz w:val="20"/>
+                      <w:szCs w:val="20"/>
+                      <w:lang w:val="en-US"/>
+                    </w:rPr>
+                    <w:t>x</w:t>
+                  </w:r>
+                </w:p>
+              </w:tc>
+              <w:tc>
+                <w:tcPr>
+                  <w:tcW w:w="1153" w:type="dxa"/>
+                </w:tcPr>
+                <w:p>
+                  <w:pPr>
+                    <w:jc w:val="center"/>
+                    <w:rPr>
+                      <w:b/>
+                      <w:bCs/>
+                      <w:sz w:val="20"/>
+                      <w:szCs w:val="20"/>
+                      <w:lang w:val="en-US"/>
+                    </w:rPr>
+                  </w:pPr>
+                  <w:r>
+                    <w:rPr>
+                      <w:b/>
+                      <w:bCs/>
+                      <w:sz w:val="20"/>
+                      <w:szCs w:val="20"/>
+                      <w:lang w:val="en-US"/>
+                    </w:rPr>
+                    <w:t>y</w:t>
+                  </w:r>
+                </w:p>
+              </w:tc>
+              <w:tc>
+                <w:tcPr>
+                  <w:tcW w:w="1154" w:type="dxa"/>
+                </w:tcPr>
+                <w:p>
+                  <w:pPr>
+                    <w:jc w:val="center"/>
+                    <w:rPr>
+                      <w:b/>
+                      <w:bCs/>
+                      <w:sz w:val="20"/>
+                      <w:szCs w:val="20"/>
+                      <w:lang w:val="en-US"/>
+                    </w:rPr>
+                  </w:pPr>
+                  <w:r>
+                    <w:rPr>
+                      <w:b/>
+                      <w:bCs/>
+                      <w:sz w:val="20"/>
+                      <w:szCs w:val="20"/>
+                      <w:lang w:val="en-US"/>
+                    </w:rPr>
+                    <w:t>z</w:t>
+                  </w:r>
+                </w:p>
+              </w:tc>
+            </w:tr>
+            <w:tr>
+              <w:tc>
+                <w:tcPr>
+                  <w:tcW w:w="1153" w:type="dxa"/>
+                </w:tcPr>
+                <w:p>
+                  <w:pPr>
+                    <w:rPr>
+                      <w:b/>
+                      <w:bCs/>
+                      <w:sz w:val="20"/>
+                      <w:szCs w:val="20"/>
+                      <w:lang w:val="en-US"/>
+                    </w:rPr>
+                  </w:pPr>
+                  <w:r>
+                    <w:rPr>
+                      <w:b/>
+                      <w:bCs/>
+                      <w:sz w:val="20"/>
+                      <w:szCs w:val="20"/>
+                    </w:rPr>
+                    <w:t>{{x_before</w:t>
+                  </w:r>
+                  <w:r>
+                    <w:rPr>
+                      <w:b/>
+                      <w:bCs/>
+                      <w:sz w:val="20"/>
+                      <w:szCs w:val="20"/>
+                    </w:rPr>
+                    <w:t>1</w:t>
+                  </w:r>
+                  <w:r>
+                    <w:rPr>
+                      <w:b/>
+                      <w:bCs/>
+                      <w:sz w:val="20"/>
+                      <w:szCs w:val="20"/>
+                    </w:rPr>
+                    <w:t>}}</w:t>
+                  </w:r>
+                </w:p>
+              </w:tc>
+              <w:tc>
+                <w:tcPr>
+                  <w:tcW w:w="1153" w:type="dxa"/>
+                </w:tcPr>
+                <w:p>
+                  <w:pPr>
+                    <w:rPr>
+                      <w:b/>
+                      <w:bCs/>
+                      <w:sz w:val="20"/>
+                      <w:szCs w:val="20"/>
+                      <w:lang w:val="en-US"/>
+                    </w:rPr>
+                  </w:pPr>
+                  <w:r>
+                    <w:rPr>
+                      <w:b/>
+                      <w:bCs/>
+                      <w:sz w:val="20"/>
+                      <w:szCs w:val="20"/>
+                    </w:rPr>
+                    <w:t>{{</w:t>
+                  </w:r>
+                  <w:r>
+                    <w:rPr>
+                      <w:b/>
+                      <w:bCs/>
+                      <w:sz w:val="20"/>
+                      <w:szCs w:val="20"/>
+                    </w:rPr>
+                    <w:t>y</w:t>
+                  </w:r>
+                  <w:r>
+                    <w:rPr>
+                      <w:b/>
+                      <w:bCs/>
+                      <w:sz w:val="20"/>
+                      <w:szCs w:val="20"/>
+                    </w:rPr>
+                    <w:t>_before</w:t>
+                  </w:r>
+                  <w:r>
+                    <w:rPr>
+                      <w:b/>
+                      <w:bCs/>
+                      <w:sz w:val="20"/>
+                      <w:szCs w:val="20"/>
+                    </w:rPr>
+                    <w:t>1</w:t>
+                  </w:r>
+                  <w:r>
+                    <w:rPr>
+                      <w:b/>
+                      <w:bCs/>
+                      <w:sz w:val="20"/>
+                      <w:szCs w:val="20"/>
+                    </w:rPr>
+                    <w:t>}}</w:t>
+                  </w:r>
+                </w:p>
+              </w:tc>
+              <w:tc>
+                <w:tcPr>
+                  <w:tcW w:w="1154" w:type="dxa"/>
+                </w:tcPr>
+                <w:p>
+                  <w:pPr>
+                    <w:rPr>
+                      <w:b/>
+                      <w:bCs/>
+                      <w:sz w:val="20"/>
+                      <w:szCs w:val="20"/>
+                      <w:lang w:val="en-US"/>
+                    </w:rPr>
+                  </w:pPr>
+                  <w:r>
+                    <w:rPr>
+                      <w:b/>
+                      <w:bCs/>
+                      <w:sz w:val="20"/>
+                      <w:szCs w:val="20"/>
+                    </w:rPr>
+                    <w:t>{{</w:t>
+                  </w:r>
+                  <w:r>
+                    <w:rPr>
+                      <w:b/>
+                      <w:bCs/>
+                      <w:sz w:val="20"/>
+                      <w:szCs w:val="20"/>
+                    </w:rPr>
+                    <w:t>z</w:t>
+                  </w:r>
+                  <w:r>
+                    <w:rPr>
+                      <w:b/>
+                      <w:bCs/>
+                      <w:sz w:val="20"/>
+                      <w:szCs w:val="20"/>
+                    </w:rPr>
+                    <w:t>_before</w:t>
+                  </w:r>
+                  <w:r>
+                    <w:rPr>
+                      <w:b/>
+                      <w:bCs/>
+                      <w:sz w:val="20"/>
+                      <w:szCs w:val="20"/>
+                    </w:rPr>
+                    <w:t>1</w:t>
+                  </w:r>
+                  <w:r>
+                    <w:rPr>
+                      <w:b/>
+                      <w:bCs/>
+                      <w:sz w:val="20"/>
+                      <w:szCs w:val="20"/>
+                    </w:rPr>
+                    <w:t>}}</w:t>
+                  </w:r>
+                </w:p>
+              </w:tc>
+            </w:tr>
+            <w:tr>
+              <w:tc>
+                <w:tcPr>
+                  <w:tcW w:w="1153" w:type="dxa"/>
+                </w:tcPr>
+                <w:p>
+                  <w:pPr>
+                    <w:rPr>
+                      <w:b/>
+                      <w:bCs/>
+                      <w:sz w:val="20"/>
+                      <w:szCs w:val="20"/>
+                      <w:lang w:val="en-US"/>
+                    </w:rPr>
+                  </w:pPr>
+                  <w:r>
+                    <w:rPr>
+                      <w:b/>
+                      <w:bCs/>
+                      <w:sz w:val="20"/>
+                      <w:szCs w:val="20"/>
+                    </w:rPr>
+                    <w:t>{{x_before}}</w:t>
+                  </w:r>
+                </w:p>
+              </w:tc>
+              <w:tc>
+                <w:tcPr>
+                  <w:tcW w:w="1153" w:type="dxa"/>
+                </w:tcPr>
+                <w:p>
+                  <w:pPr>
+                    <w:rPr>
+                      <w:b/>
+                      <w:bCs/>
+                      <w:sz w:val="20"/>
+                      <w:szCs w:val="20"/>
+                      <w:lang w:val="en-US"/>
+                    </w:rPr>
+                  </w:pPr>
+                  <w:r>
+                    <w:rPr>
+                      <w:b/>
+                      <w:bCs/>
+                      <w:sz w:val="20"/>
+                      <w:szCs w:val="20"/>
+                    </w:rPr>
+                    <w:t>{{</w:t>
+                  </w:r>
+                  <w:r>
+                    <w:rPr>
+                      <w:b/>
+                      <w:bCs/>
+                      <w:sz w:val="20"/>
+                      <w:szCs w:val="20"/>
+                    </w:rPr>
+                    <w:t>y</w:t>
+                  </w:r>
+                  <w:r>
+                    <w:rPr>
+                      <w:b/>
+                      <w:bCs/>
+                      <w:sz w:val="20"/>
+                      <w:szCs w:val="20"/>
+                    </w:rPr>
+                    <w:t>_before}}</w:t>
+                  </w:r>
+                </w:p>
+              </w:tc>
+              <w:tc>
+                <w:tcPr>
+                  <w:tcW w:w="1154" w:type="dxa"/>
+                </w:tcPr>
+                <w:p>
+                  <w:pPr>
+                    <w:rPr>
+                      <w:b/>
+                      <w:bCs/>
+                      <w:sz w:val="20"/>
+                      <w:szCs w:val="20"/>
+                      <w:lang w:val="en-US"/>
+                    </w:rPr>
+                  </w:pPr>
+                  <w:r>
+                    <w:rPr>
+                      <w:b/>
+                      <w:bCs/>
+                      <w:sz w:val="20"/>
+                      <w:szCs w:val="20"/>
+                    </w:rPr>
+                    <w:t>{{</w:t>
+                  </w:r>
+                  <w:r>
+                    <w:rPr>
+                      <w:b/>
+                      <w:bCs/>
+                      <w:sz w:val="20"/>
+                      <w:szCs w:val="20"/>
+                    </w:rPr>
+                    <w:t>z</w:t>
+                  </w:r>
+                  <w:r>
+                    <w:rPr>
+                      <w:b/>
+                      <w:bCs/>
+                      <w:sz w:val="20"/>
+                      <w:szCs w:val="20"/>
+                    </w:rPr>
+                    <w:t>_before}}</w:t>
+                  </w:r>
+                </w:p>
+              </w:tc>
+            </w:tr>
+            <w:tr>
+              <w:tc>
+                <w:tcPr>
+                  <w:tcW w:w="1153" w:type="dxa"/>
+                </w:tcPr>
+                <w:p>
+                  <w:pPr>
+                    <w:rPr>
+                      <w:b/>
+                      <w:bCs/>
+                      <w:sz w:val="20"/>
+                      <w:szCs w:val="20"/>
+                      <w:lang w:val="en-US"/>
+                    </w:rPr>
+                  </w:pPr>
+                  <w:r>
+                    <w:rPr>
+                      <w:b/>
+                      <w:bCs/>
+                      <w:sz w:val="20"/>
+                      <w:szCs w:val="20"/>
+                    </w:rPr>
+                    <w:t>{{x_</w:t>
+                  </w:r>
+                  <w:r>
+                    <w:rPr>
+                      <w:b/>
+                      <w:bCs/>
+                      <w:sz w:val="20"/>
+                      <w:szCs w:val="20"/>
+                    </w:rPr>
+                    <w:t>after</w:t>
+                  </w:r>
+                  <w:r>
+                    <w:rPr>
+                      <w:b/>
+                      <w:bCs/>
+                      <w:sz w:val="20"/>
+                      <w:szCs w:val="20"/>
+                    </w:rPr>
+                    <w:t>}}</w:t>
+                  </w:r>
+                </w:p>
+              </w:tc>
+              <w:tc>
+                <w:tcPr>
+                  <w:tcW w:w="1153" w:type="dxa"/>
+                </w:tcPr>
+                <w:p>
+                  <w:pPr>
+                    <w:rPr>
+                      <w:b/>
+                      <w:bCs/>
+                      <w:sz w:val="20"/>
+                      <w:szCs w:val="20"/>
+                      <w:lang w:val="en-US"/>
+                    </w:rPr>
+                  </w:pPr>
+                  <w:r>
+                    <w:rPr>
+                      <w:b/>
+                      <w:bCs/>
+                      <w:sz w:val="20"/>
+                      <w:szCs w:val="20"/>
+                    </w:rPr>
+                    <w:t>{{</w:t>
+                  </w:r>
+                  <w:r>
+                    <w:rPr>
+                      <w:b/>
+                      <w:bCs/>
+                      <w:sz w:val="20"/>
+                      <w:szCs w:val="20"/>
+                    </w:rPr>
+                    <w:t>y</w:t>
+                  </w:r>
+                  <w:r>
+                    <w:rPr>
+                      <w:b/>
+                      <w:bCs/>
+                      <w:sz w:val="20"/>
+                      <w:szCs w:val="20"/>
+                    </w:rPr>
+                    <w:t>_</w:t>
+                  </w:r>
+                  <w:r>
+                    <w:rPr>
+                      <w:b/>
+                      <w:bCs/>
+                      <w:sz w:val="20"/>
+                      <w:szCs w:val="20"/>
+                    </w:rPr>
+                    <w:t>after</w:t>
+                  </w:r>
+                  <w:r>
+                    <w:rPr>
+                      <w:b/>
+                      <w:bCs/>
+                      <w:sz w:val="20"/>
+                      <w:szCs w:val="20"/>
+                    </w:rPr>
+                    <w:t>}}</w:t>
+                  </w:r>
+                </w:p>
+              </w:tc>
+              <w:tc>
+                <w:tcPr>
+                  <w:tcW w:w="1154" w:type="dxa"/>
+                </w:tcPr>
+                <w:p>
+                  <w:pPr>
+                    <w:rPr>
+                      <w:b/>
+                      <w:bCs/>
+                      <w:sz w:val="20"/>
+                      <w:szCs w:val="20"/>
+                      <w:lang w:val="en-US"/>
+                    </w:rPr>
+                  </w:pPr>
+                  <w:r>
+                    <w:rPr>
+                      <w:b/>
+                      <w:bCs/>
+                      <w:sz w:val="20"/>
+                      <w:szCs w:val="20"/>
+                    </w:rPr>
+                    <w:t>{{</w:t>
+                  </w:r>
+                  <w:r>
+                    <w:rPr>
+                      <w:b/>
+                      <w:bCs/>
+                      <w:sz w:val="20"/>
+                      <w:szCs w:val="20"/>
+                    </w:rPr>
+                    <w:t>z</w:t>
+                  </w:r>
+                  <w:r>
+                    <w:rPr>
+                      <w:b/>
+                      <w:bCs/>
+                      <w:sz w:val="20"/>
+                      <w:szCs w:val="20"/>
+                    </w:rPr>
+                    <w:t>_</w:t>
+                  </w:r>
+                  <w:r>
+                    <w:rPr>
+                      <w:b/>
+                      <w:bCs/>
+                      <w:sz w:val="20"/>
+                      <w:szCs w:val="20"/>
+                    </w:rPr>
+                    <w:t>after</w:t>
+                  </w:r>
+                  <w:r>
+                    <w:rPr>
+                      <w:b/>
+                      <w:bCs/>
+                      <w:sz w:val="20"/>
+                      <w:szCs w:val="20"/>
+                    </w:rPr>
+                    <w:t>}}</w:t>
+                  </w:r>
+                </w:p>
+              </w:tc>
+            </w:tr>
+          </w:tbl>
+          <w:p>
+            <w:pPr>
+              <w:shd w:val="clear" w:color="auto" w:fill="FFFFFF" w:themeFill="background1"/>
+              <w:rPr>
+                <w:b/>
+                <w:bCs/>
+                <w:sz w:val="20"/>
+                <w:szCs w:val="20"/>
+                <w:lang w:val="en-US"/>
+              </w:rPr>
+            </w:pPr>
+            <w:r>
+              <w:rPr>
+                <w:b/>
+                <w:bCs/>
+                <w:sz w:val="20"/>
+                <w:szCs w:val="20"/>
+                <w:lang w:val="en-US"/>
+              </w:rPr>
+              <w:t>{</w:t>
+            </w:r>
+            <w:r>
+              <w:rPr>
+                <w:b/>
+                <w:bCs/>
+                <w:sz w:val="20"/>
+                <w:szCs w:val="20"/>
+                <w:lang w:val="en-US"/>
+              </w:rPr>
+              <w:t>{</w:t>
+            </w:r>
+            <w:r>
+              <w:rPr>
+                <w:b/>
+                <w:bCs/>
+                <w:sz w:val="20"/>
+                <w:szCs w:val="20"/>
+                <w:lang w:val="en-US"/>
+              </w:rPr>
+              <w:t>/has_measurements</w:t>
+            </w:r>
+            <w:r>
+              <w:rPr>
+                <w:b/>
+                <w:bCs/>
+                <w:sz w:val="20"/>
+                <w:szCs w:val="20"/>
+                <w:lang w:val="en-US"/>
+              </w:rPr>
+              <w:t>}</w:t>
+            </w:r>
+            <w:r>
+              <w:rPr>
+                <w:b/>
+                <w:bCs/>
+                <w:sz w:val="20"/>
+                <w:szCs w:val="20"/>
+                <w:lang w:val="en-US"/>
+              </w:rPr>
+              <w:t>}</w:t>
+            </w:r>
+          </w:p>
+          <w:p>
+            <w:pPr>
+              <w:shd w:val="clear" w:color="auto" w:fill="FFFFFF" w:themeFill="background1"/>
+              <w:rPr>
+                <w:b/>
+                <w:bCs/>
+                <w:sz w:val="20"/>
+                <w:szCs w:val="20"/>
+                <w:lang w:val="en-US"/>
+              </w:rPr>
+            </w:pPr>
+          </w:p>
+        </w:tc>
+        <w:tc>
+          <w:tcPr>
             <w:tcW w:w="1842" w:type="dxa"/>
           </w:tcPr>
           <w:p>
@@ -3829,14 +4505,9 @@
                 <w:szCs w:val="20"/>
                 <w:lang w:val="en-US"/>
               </w:rPr>
-              <w:t>{@condition}</w:t>
-            </w:r>
-          </w:p>
-        </w:tc>
-        <w:tc>
-          <w:tcPr>
-            <w:tcW w:w="3260" w:type="dxa"/>
-          </w:tcPr>
+              <w:t>{{#measure_procedures}}</w:t>
+            </w:r>
+          </w:p>
           <w:p>
             <w:pPr>
               <w:shd w:val="clear" w:color="auto" w:fill="FFFFFF" w:themeFill="background1"/>
@@ -3856,7 +4527,29 @@
                 <w:szCs w:val="20"/>
                 <w:lang w:val="en-US"/>
               </w:rPr>
-              <w:t>{@measure}</w:t>
+              <w:t>{{list}}. {{desc}}</w:t>
+            </w:r>
+          </w:p>
+          <w:p>
+            <w:pPr>
+              <w:shd w:val="clear" w:color="auto" w:fill="FFFFFF" w:themeFill="background1"/>
+              <w:rPr>
+                <w:b/>
+                <w:bCs/>
+                <w:sz w:val="20"/>
+                <w:szCs w:val="20"/>
+                <w:lang w:val="en-US"/>
+              </w:rPr>
+            </w:pPr>
+            <w:r>
+              <w:rPr>
+                <w:b/>
+                <w:bCs/>
+                <w:sz w:val="20"/>
+                <w:szCs w:val="20"/>
+                <w:lang w:val="en-US"/>
+              </w:rPr>
+              <w:t>{{/measure_procedures}}</w:t>
             </w:r>
           </w:p>
           <w:p>
@@ -3886,23 +4579,115 @@
         </w:tc>
         <w:tc>
           <w:tcPr>
-            <w:tcW w:w="3828" w:type="dxa"/>
+            <w:tcW w:w="3402" w:type="dxa"/>
             <w:gridSpan w:val="2"/>
           </w:tcPr>
           <w:p>
             <w:r>
-              <w:t>{{%image1}}</w:t>
-            </w:r>
-          </w:p>
-        </w:tc>
-        <w:tc>
-          <w:tcPr>
-            <w:tcW w:w="5102" w:type="dxa"/>
+              <w:t>{</w:t>
+            </w:r>
+            <w:r>
+              <w:t>{</w:t>
+            </w:r>
+            <w:r>
+              <w:t>%image1}</w:t>
+            </w:r>
+            <w:r>
+              <w:t>}</w:t>
+            </w:r>
+          </w:p>
+          <w:p>
+            <w:r>
+              <w:t>{</w:t>
+            </w:r>
+            <w:r>
+              <w:t>{</w:t>
+            </w:r>
+            <w:r>
+              <w:t>%image2}</w:t>
+            </w:r>
+            <w:r>
+              <w:t>}</w:t>
+            </w:r>
+          </w:p>
+          <w:p>
+            <w:r>
+              <w:t>{</w:t>
+            </w:r>
+            <w:r>
+              <w:t>{</w:t>
+            </w:r>
+            <w:r>
+              <w:t>%image3}</w:t>
+            </w:r>
+            <w:r>
+              <w:t>}</w:t>
+            </w:r>
+          </w:p>
+        </w:tc>
+        <w:tc>
+          <w:tcPr>
+            <w:tcW w:w="5528" w:type="dxa"/>
             <w:gridSpan w:val="2"/>
           </w:tcPr>
           <w:p>
             <w:r>
-              <w:t>{{%image2}}</w:t>
+              <w:t>{</w:t>
+            </w:r>
+            <w:r>
+              <w:t>{</w:t>
+            </w:r>
+            <w:r>
+              <w:t>%image</w:t>
+            </w:r>
+            <w:r>
+              <w:t>4</w:t>
+            </w:r>
+            <w:r>
+              <w:t>}</w:t>
+            </w:r>
+            <w:r>
+              <w:t>}</w:t>
+            </w:r>
+          </w:p>
+          <w:p>
+            <w:r>
+              <w:t>{</w:t>
+            </w:r>
+            <w:r>
+              <w:t>{</w:t>
+            </w:r>
+            <w:r>
+              <w:t>%image</w:t>
+            </w:r>
+            <w:r>
+              <w:t>5</w:t>
+            </w:r>
+            <w:r>
+              <w:t>}</w:t>
+            </w:r>
+            <w:r>
+              <w:t>}</w:t>
+            </w:r>
+          </w:p>
+          <w:p>
+            <w:r>
+              <w:t>{</w:t>
+            </w:r>
+            <w:r>
+              <w:t>{</w:t>
+            </w:r>
+            <w:r>
+              <w:t>%image</w:t>
+            </w:r>
+            <w:r>
+              <w:t>6</w:t>
+            </w:r>
+            <w:r>
+              <w:t>}</w:t>
+            </w:r>
+            <w:r>
+              <w:t>}</w:t>
             </w:r>
           </w:p>
         </w:tc>
@@ -3975,7 +4760,27 @@
                 <w:szCs w:val="20"/>
                 <w:lang w:val="en-US"/>
               </w:rPr>
-              <w:t>{{deskripsi}}</w:t>
+              <w:t>{{</w:t>
+            </w:r>
+            <w:r>
+              <w:rPr>
+                <w:b/>
+                <w:bCs/>
+                <w:sz w:val="20"/>
+                <w:szCs w:val="20"/>
+                <w:lang w:val="en-US"/>
+              </w:rPr>
+              <w:t>remarks</w:t>
+            </w:r>
+            <w:r>
+              <w:rPr>
+                <w:b/>
+                <w:bCs/>
+                <w:sz w:val="20"/>
+                <w:szCs w:val="20"/>
+                <w:lang w:val="en-US"/>
+              </w:rPr>
+              <w:t>}}</w:t>
             </w:r>
           </w:p>
         </w:tc>
@@ -4591,7 +5396,6 @@
               <w:lang w:val="en-US"/>
             </w:rPr>
           </w:pPr>
-          <w:proofErr w:type="gramStart"/>
           <w:r>
             <w:rPr>
               <w:rFonts w:cstheme="minorHAnsi"/>
@@ -4602,78 +5406,6 @@
               <w:lang w:val="en-US"/>
             </w:rPr>
             <w:t>Alamat :</w:t>
-          </w:r>
-          <w:proofErr w:type="gramEnd"/>
-          <w:r>
-            <w:rPr>
-              <w:rFonts w:cstheme="minorHAnsi"/>
-              <w:b/>
-              <w:bCs/>
-              <w:sz w:val="16"/>
-              <w:szCs w:val="16"/>
-              <w:lang w:val="en-US"/>
-            </w:rPr>
-            <w:t xml:space="preserve"> </w:t>
-          </w:r>
-          <w:proofErr w:type="spellStart"/>
-          <w:r>
-            <w:rPr>
-              <w:rFonts w:cstheme="minorHAnsi"/>
-              <w:b/>
-              <w:bCs/>
-              <w:sz w:val="16"/>
-              <w:szCs w:val="16"/>
-              <w:lang w:val="en-US"/>
-            </w:rPr>
-            <w:t>Jln</w:t>
-          </w:r>
-          <w:proofErr w:type="spellEnd"/>
-          <w:r>
-            <w:rPr>
-              <w:rFonts w:cstheme="minorHAnsi"/>
-              <w:b/>
-              <w:bCs/>
-              <w:sz w:val="16"/>
-              <w:szCs w:val="16"/>
-              <w:lang w:val="en-US"/>
-            </w:rPr>
-            <w:t xml:space="preserve">. AMD RT. 46 Komp. </w:t>
-          </w:r>
-          <w:proofErr w:type="spellStart"/>
-          <w:r>
-            <w:rPr>
-              <w:rFonts w:cstheme="minorHAnsi"/>
-              <w:b/>
-              <w:bCs/>
-              <w:sz w:val="16"/>
-              <w:szCs w:val="16"/>
-              <w:lang w:val="en-US"/>
-            </w:rPr>
-            <w:t>Pergudangan</w:t>
-          </w:r>
-          <w:proofErr w:type="spellEnd"/>
-          <w:r>
-            <w:rPr>
-              <w:rFonts w:cstheme="minorHAnsi"/>
-              <w:b/>
-              <w:bCs/>
-              <w:sz w:val="16"/>
-              <w:szCs w:val="16"/>
-              <w:lang w:val="en-US"/>
-            </w:rPr>
-            <w:t xml:space="preserve"> Mulia Prima Blok A No. 6 </w:t>
-          </w:r>
-          <w:proofErr w:type="gramStart"/>
-          <w:r>
-            <w:rPr>
-              <w:rFonts w:cstheme="minorHAnsi"/>
-              <w:b/>
-              <w:bCs/>
-              <w:sz w:val="16"/>
-              <w:szCs w:val="16"/>
-              <w:lang w:val="en-US"/>
-            </w:rPr>
-            <w:t>Telp</w:t>
           </w:r>
           <w:r>
             <w:rPr>
@@ -4695,9 +5427,8 @@
               <w:szCs w:val="16"/>
               <w:lang w:val="en-US"/>
             </w:rPr>
-            <w:t>:</w:t>
+            <w:t>Jln. AMD RT. 46 Komp. Pergudangan Mulia Prima Blok A No. 6 Telp</w:t>
           </w:r>
-          <w:proofErr w:type="gramEnd"/>
           <w:r>
             <w:rPr>
               <w:rFonts w:cstheme="minorHAnsi"/>
@@ -4707,7 +5438,18 @@
               <w:szCs w:val="16"/>
               <w:lang w:val="en-US"/>
             </w:rPr>
-            <w:t xml:space="preserve"> (0542) 8532942</w:t>
+            <w:t xml:space="preserve"> </w:t>
+          </w:r>
+          <w:r>
+            <w:rPr>
+              <w:rFonts w:cstheme="minorHAnsi"/>
+              <w:b/>
+              <w:bCs/>
+              <w:sz w:val="16"/>
+              <w:szCs w:val="16"/>
+              <w:lang w:val="en-US"/>
+            </w:rPr>
+            <w:t>: (0542) 8532942</w:t>
           </w:r>
         </w:p>
         <w:p>
@@ -4927,8 +5669,100 @@
       </w:rPr>
     </w:lvl>
   </w:abstractNum>
+  <w:abstractNum w:abstractNumId="1" w15:restartNumberingAfterBreak="0">
+    <w:nsid w:val="71A17508"/>
+    <w:multiLevelType w:val="hybridMultilevel"/>
+    <w:tmpl w:val="14E4F32C"/>
+    <w:lvl w:ilvl="0" w:tplc="0409000F">
+      <w:start w:val="1"/>
+      <w:numFmt w:val="decimal"/>
+      <w:lvlText w:val="%1."/>
+      <w:lvlJc w:val="left"/>
+      <w:pPr>
+        <w:ind w:left="720" w:hanging="360"/>
+      </w:pPr>
+      <w:rPr>
+        <w:rFonts w:hint="default"/>
+      </w:rPr>
+    </w:lvl>
+    <w:lvl w:ilvl="1" w:tplc="04090019" w:tentative="1">
+      <w:start w:val="1"/>
+      <w:numFmt w:val="lowerLetter"/>
+      <w:lvlText w:val="%2."/>
+      <w:lvlJc w:val="left"/>
+      <w:pPr>
+        <w:ind w:left="1440" w:hanging="360"/>
+      </w:pPr>
+    </w:lvl>
+    <w:lvl w:ilvl="2" w:tplc="0409001B" w:tentative="1">
+      <w:start w:val="1"/>
+      <w:numFmt w:val="lowerRoman"/>
+      <w:lvlText w:val="%3."/>
+      <w:lvlJc w:val="right"/>
+      <w:pPr>
+        <w:ind w:left="2160" w:hanging="180"/>
+      </w:pPr>
+    </w:lvl>
+    <w:lvl w:ilvl="3" w:tplc="0409000F" w:tentative="1">
+      <w:start w:val="1"/>
+      <w:numFmt w:val="decimal"/>
+      <w:lvlText w:val="%4."/>
+      <w:lvlJc w:val="left"/>
+      <w:pPr>
+        <w:ind w:left="2880" w:hanging="360"/>
+      </w:pPr>
+    </w:lvl>
+    <w:lvl w:ilvl="4" w:tplc="04090019" w:tentative="1">
+      <w:start w:val="1"/>
+      <w:numFmt w:val="lowerLetter"/>
+      <w:lvlText w:val="%5."/>
+      <w:lvlJc w:val="left"/>
+      <w:pPr>
+        <w:ind w:left="3600" w:hanging="360"/>
+      </w:pPr>
+    </w:lvl>
+    <w:lvl w:ilvl="5" w:tplc="0409001B" w:tentative="1">
+      <w:start w:val="1"/>
+      <w:numFmt w:val="lowerRoman"/>
+      <w:lvlText w:val="%6."/>
+      <w:lvlJc w:val="right"/>
+      <w:pPr>
+        <w:ind w:left="4320" w:hanging="180"/>
+      </w:pPr>
+    </w:lvl>
+    <w:lvl w:ilvl="6" w:tplc="0409000F" w:tentative="1">
+      <w:start w:val="1"/>
+      <w:numFmt w:val="decimal"/>
+      <w:lvlText w:val="%7."/>
+      <w:lvlJc w:val="left"/>
+      <w:pPr>
+        <w:ind w:left="5040" w:hanging="360"/>
+      </w:pPr>
+    </w:lvl>
+    <w:lvl w:ilvl="7" w:tplc="04090019" w:tentative="1">
+      <w:start w:val="1"/>
+      <w:numFmt w:val="lowerLetter"/>
+      <w:lvlText w:val="%8."/>
+      <w:lvlJc w:val="left"/>
+      <w:pPr>
+        <w:ind w:left="5760" w:hanging="360"/>
+      </w:pPr>
+    </w:lvl>
+    <w:lvl w:ilvl="8" w:tplc="0409001B" w:tentative="1">
+      <w:start w:val="1"/>
+      <w:numFmt w:val="lowerRoman"/>
+      <w:lvlText w:val="%9."/>
+      <w:lvlJc w:val="right"/>
+      <w:pPr>
+        <w:ind w:left="6480" w:hanging="180"/>
+      </w:pPr>
+    </w:lvl>
+  </w:abstractNum>
   <w:num w:numId="1" w16cid:durableId="173038372">
     <w:abstractNumId w:val="0"/>
+  </w:num>
+  <w:num w:numId="2" w16cid:durableId="1064648127">
+    <w:abstractNumId w:val="1"/>
   </w:num>
 </w:numbering>
 </file>
@@ -5539,7 +6373,6 @@
   <w:style w:type="character" w:default="1" w:styleId="DefaultParagraphFont">
     <w:name w:val="Default Paragraph Font"/>
     <w:uiPriority w:val="1"/>
-    <w:semiHidden/>
     <w:unhideWhenUsed/>
   </w:style>
   <w:style w:type="table" w:default="1" w:styleId="TableNormal">

</xml_diff>